<commit_message>
feat: further fixes in template and report logic #BKDO-3693
</commit_message>
<xml_diff>
--- a/src/Bk.APG.Api/Templates/ElectoralList_FederalCouncil.docx
+++ b/src/Bk.APG.Api/Templates/ElectoralList_FederalCouncil.docx
@@ -4,7 +4,7 @@
   <w:body>
     <w:p>
       <w:pPr>
-        <w:pStyle w:val="NoSpacing"/>
+        <w:pStyle w:val="KeinLeerraum"/>
         <w:rPr>
           <w:sz w:val="18"/>
           <w:szCs w:val="18"/>
@@ -23,7 +23,7 @@
     </w:p>
     <w:p>
       <w:pPr>
-        <w:pStyle w:val="NoSpacing"/>
+        <w:pStyle w:val="KeinLeerraum"/>
         <w:tabs>
           <w:tab w:val="right" w:pos="10466"/>
         </w:tabs>
@@ -121,7 +121,7 @@
     </w:p>
     <w:p>
       <w:pPr>
-        <w:pStyle w:val="TOC1"/>
+        <w:pStyle w:val="Verzeichnis1"/>
         <w:tabs>
           <w:tab w:val="right" w:leader="dot" w:pos="10456"/>
         </w:tabs>
@@ -134,7 +134,7 @@
     </w:p>
     <w:p>
       <w:pPr>
-        <w:pStyle w:val="TOC1"/>
+        <w:pStyle w:val="Verzeichnis1"/>
         <w:tabs>
           <w:tab w:val="right" w:leader="dot" w:pos="10456"/>
         </w:tabs>
@@ -169,7 +169,7 @@
     </w:p>
     <w:p>
       <w:pPr>
-        <w:pStyle w:val="TOC1"/>
+        <w:pStyle w:val="Verzeichnis1"/>
         <w:tabs>
           <w:tab w:val="right" w:leader="dot" w:pos="10456"/>
         </w:tabs>
@@ -238,7 +238,7 @@
     </w:p>
     <w:p>
       <w:pPr>
-        <w:pStyle w:val="TOC2"/>
+        <w:pStyle w:val="Verzeichnis2"/>
         <w:rPr>
           <w:rFonts w:eastAsiaTheme="minorEastAsia" w:cstheme="minorBidi"/>
           <w:smallCaps w:val="0"/>
@@ -258,21 +258,21 @@
         </w:r>
         <w:r>
           <w:rPr>
-            <w:rFonts w:eastAsiaTheme="minorEastAsia" w:cstheme="minorBidi"/>
-            <w:smallCaps w:val="0"/>
-            <w:kern w:val="2"/>
-            <w:sz w:val="24"/>
-            <w:szCs w:val="24"/>
-            <w:lang w:val="de-CH" w:eastAsia="de-CH"/>
-            <w14:ligatures w14:val="standardContextual"/>
+            <w:rStyle w:val="Hyperlink"/>
           </w:rPr>
-          <w:tab/>
+          <w:t xml:space="preserve"> (</w:t>
         </w:r>
         <w:r>
           <w:rPr>
             <w:rStyle w:val="Hyperlink"/>
           </w:rPr>
           <w:t>department.name</w:t>
+        </w:r>
+        <w:r>
+          <w:rPr>
+            <w:rStyle w:val="Hyperlink"/>
+          </w:rPr>
+          <w:t>)</w:t>
         </w:r>
         <w:r>
           <w:rPr>
@@ -319,7 +319,7 @@
     </w:p>
     <w:p>
       <w:pPr>
-        <w:pStyle w:val="TOC1"/>
+        <w:pStyle w:val="Verzeichnis1"/>
         <w:tabs>
           <w:tab w:val="right" w:leader="dot" w:pos="10456"/>
         </w:tabs>
@@ -415,7 +415,7 @@
     </w:p>
     <w:p>
       <w:pPr>
-        <w:pStyle w:val="Heading1"/>
+        <w:pStyle w:val="berschrift1"/>
         <w:rPr>
           <w:lang w:val="en-US"/>
         </w:rPr>
@@ -469,7 +469,7 @@
     </w:p>
     <w:p>
       <w:pPr>
-        <w:pStyle w:val="NoSpacing"/>
+        <w:pStyle w:val="KeinLeerraum"/>
         <w:keepNext/>
         <w:spacing w:before="240" w:after="60"/>
         <w:rPr>
@@ -494,7 +494,7 @@
     </w:p>
     <w:p>
       <w:pPr>
-        <w:pStyle w:val="NoSpacing"/>
+        <w:pStyle w:val="KeinLeerraum"/>
         <w:keepNext/>
         <w:spacing w:before="240" w:after="60"/>
         <w:rPr>
@@ -512,7 +512,7 @@
     </w:p>
     <w:tbl>
       <w:tblPr>
-        <w:tblStyle w:val="TableGrid"/>
+        <w:tblStyle w:val="Tabellenraster"/>
         <w:tblW w:w="15309" w:type="dxa"/>
         <w:tblLayout w:type="fixed"/>
         <w:tblLook w:val="04A0" w:firstRow="1" w:lastRow="0" w:firstColumn="1" w:lastColumn="0" w:noHBand="0" w:noVBand="1"/>
@@ -547,7 +547,7 @@
           </w:tcPr>
           <w:p>
             <w:pPr>
-              <w:pStyle w:val="Heading2"/>
+              <w:pStyle w:val="berschrift2"/>
             </w:pPr>
             <w:bookmarkStart w:id="2" w:name="_Toc148094839"/>
             <w:bookmarkStart w:id="3" w:name="_Toc148096670"/>
@@ -557,7 +557,7 @@
               <w:t>&lt;&lt;[committee.name]&gt;&gt;</w:t>
             </w:r>
             <w:r>
-              <w:tab/>
+              <w:t xml:space="preserve"> (</w:t>
             </w:r>
             <w:bookmarkEnd w:id="2"/>
             <w:bookmarkEnd w:id="3"/>
@@ -566,6 +566,9 @@
             </w:r>
             <w:bookmarkEnd w:id="4"/>
             <w:bookmarkEnd w:id="5"/>
+            <w:r>
+              <w:t>)</w:t>
+            </w:r>
           </w:p>
         </w:tc>
       </w:tr>
@@ -587,7 +590,7 @@
           </w:tcPr>
           <w:p>
             <w:pPr>
-              <w:pStyle w:val="NoSpacing"/>
+              <w:pStyle w:val="KeinLeerraum"/>
               <w:keepNext/>
               <w:rPr>
                 <w:sz w:val="18"/>
@@ -633,7 +636,7 @@
           </w:tcPr>
           <w:p>
             <w:pPr>
-              <w:pStyle w:val="NoSpacing"/>
+              <w:pStyle w:val="KeinLeerraum"/>
               <w:keepNext/>
               <w:rPr>
                 <w:sz w:val="18"/>
@@ -682,7 +685,7 @@
           </w:tcPr>
           <w:p>
             <w:pPr>
-              <w:pStyle w:val="NoSpacing"/>
+              <w:pStyle w:val="KeinLeerraum"/>
               <w:keepNext/>
               <w:rPr>
                 <w:sz w:val="18"/>
@@ -728,7 +731,7 @@
           </w:tcPr>
           <w:p>
             <w:pPr>
-              <w:pStyle w:val="NoSpacing"/>
+              <w:pStyle w:val="KeinLeerraum"/>
               <w:keepNext/>
               <w:rPr>
                 <w:sz w:val="18"/>
@@ -774,7 +777,7 @@
           </w:tcPr>
           <w:p>
             <w:pPr>
-              <w:pStyle w:val="NoSpacing"/>
+              <w:pStyle w:val="KeinLeerraum"/>
               <w:keepNext/>
               <w:rPr>
                 <w:sz w:val="18"/>
@@ -820,7 +823,7 @@
           </w:tcPr>
           <w:p>
             <w:pPr>
-              <w:pStyle w:val="NoSpacing"/>
+              <w:pStyle w:val="KeinLeerraum"/>
               <w:keepNext/>
               <w:rPr>
                 <w:sz w:val="18"/>
@@ -866,7 +869,7 @@
           </w:tcPr>
           <w:p>
             <w:pPr>
-              <w:pStyle w:val="NoSpacing"/>
+              <w:pStyle w:val="KeinLeerraum"/>
               <w:keepNext/>
               <w:rPr>
                 <w:sz w:val="18"/>
@@ -912,7 +915,7 @@
           </w:tcPr>
           <w:p>
             <w:pPr>
-              <w:pStyle w:val="NoSpacing"/>
+              <w:pStyle w:val="KeinLeerraum"/>
               <w:keepNext/>
               <w:rPr>
                 <w:sz w:val="18"/>
@@ -958,7 +961,7 @@
           </w:tcPr>
           <w:p>
             <w:pPr>
-              <w:pStyle w:val="NoSpacing"/>
+              <w:pStyle w:val="KeinLeerraum"/>
               <w:keepNext/>
               <w:rPr>
                 <w:sz w:val="18"/>
@@ -1004,7 +1007,7 @@
           </w:tcPr>
           <w:p>
             <w:pPr>
-              <w:pStyle w:val="NoSpacing"/>
+              <w:pStyle w:val="KeinLeerraum"/>
               <w:keepNext/>
               <w:rPr>
                 <w:sz w:val="18"/>
@@ -1061,7 +1064,7 @@
           </w:tcPr>
           <w:p>
             <w:pPr>
-              <w:pStyle w:val="NoSpacing"/>
+              <w:pStyle w:val="KeinLeerraum"/>
               <w:keepNext/>
               <w:spacing w:before="40" w:after="40"/>
               <w:rPr>
@@ -1111,11 +1114,10 @@
               <w:top w:val="single" w:sz="4" w:space="0" w:color="auto"/>
               <w:bottom w:val="nil"/>
             </w:tcBorders>
-            <w:shd w:val="clear" w:color="auto" w:fill="auto"/>
           </w:tcPr>
           <w:p>
             <w:pPr>
-              <w:pStyle w:val="NoSpacing"/>
+              <w:pStyle w:val="KeinLeerraum"/>
               <w:rPr>
                 <w:sz w:val="18"/>
                 <w:szCs w:val="18"/>
@@ -1203,11 +1205,10 @@
               <w:top w:val="single" w:sz="4" w:space="0" w:color="auto"/>
               <w:bottom w:val="nil"/>
             </w:tcBorders>
-            <w:shd w:val="clear" w:color="auto" w:fill="auto"/>
           </w:tcPr>
           <w:p>
             <w:pPr>
-              <w:pStyle w:val="NoSpacing"/>
+              <w:pStyle w:val="KeinLeerraum"/>
               <w:rPr>
                 <w:sz w:val="18"/>
                 <w:szCs w:val="18"/>
@@ -1231,11 +1232,10 @@
               <w:top w:val="single" w:sz="4" w:space="0" w:color="auto"/>
               <w:bottom w:val="nil"/>
             </w:tcBorders>
-            <w:shd w:val="clear" w:color="auto" w:fill="auto"/>
           </w:tcPr>
           <w:p>
             <w:pPr>
-              <w:pStyle w:val="NoSpacing"/>
+              <w:pStyle w:val="KeinLeerraum"/>
               <w:rPr>
                 <w:sz w:val="18"/>
                 <w:szCs w:val="18"/>
@@ -1262,7 +1262,7 @@
           </w:tcPr>
           <w:p>
             <w:pPr>
-              <w:pStyle w:val="NoSpacing"/>
+              <w:pStyle w:val="KeinLeerraum"/>
               <w:rPr>
                 <w:sz w:val="18"/>
                 <w:szCs w:val="18"/>
@@ -1286,11 +1286,10 @@
               <w:top w:val="single" w:sz="4" w:space="0" w:color="auto"/>
               <w:bottom w:val="nil"/>
             </w:tcBorders>
-            <w:shd w:val="clear" w:color="auto" w:fill="auto"/>
           </w:tcPr>
           <w:p>
             <w:pPr>
-              <w:pStyle w:val="NoSpacing"/>
+              <w:pStyle w:val="KeinLeerraum"/>
               <w:rPr>
                 <w:sz w:val="18"/>
                 <w:szCs w:val="18"/>
@@ -1376,11 +1375,10 @@
               <w:top w:val="single" w:sz="4" w:space="0" w:color="auto"/>
               <w:bottom w:val="nil"/>
             </w:tcBorders>
-            <w:shd w:val="clear" w:color="auto" w:fill="auto"/>
           </w:tcPr>
           <w:p>
             <w:pPr>
-              <w:pStyle w:val="NoSpacing"/>
+              <w:pStyle w:val="KeinLeerraum"/>
               <w:rPr>
                 <w:sz w:val="18"/>
                 <w:szCs w:val="18"/>
@@ -1460,11 +1458,10 @@
               <w:top w:val="single" w:sz="4" w:space="0" w:color="auto"/>
               <w:bottom w:val="nil"/>
             </w:tcBorders>
-            <w:shd w:val="clear" w:color="auto" w:fill="auto"/>
           </w:tcPr>
           <w:p>
             <w:pPr>
-              <w:pStyle w:val="NoSpacing"/>
+              <w:pStyle w:val="KeinLeerraum"/>
               <w:rPr>
                 <w:sz w:val="18"/>
                 <w:szCs w:val="18"/>
@@ -1488,11 +1485,10 @@
               <w:top w:val="single" w:sz="4" w:space="0" w:color="auto"/>
               <w:bottom w:val="nil"/>
             </w:tcBorders>
-            <w:shd w:val="clear" w:color="auto" w:fill="auto"/>
           </w:tcPr>
           <w:p>
             <w:pPr>
-              <w:pStyle w:val="NoSpacing"/>
+              <w:pStyle w:val="KeinLeerraum"/>
               <w:rPr>
                 <w:sz w:val="18"/>
                 <w:szCs w:val="18"/>
@@ -1516,11 +1512,10 @@
               <w:top w:val="single" w:sz="4" w:space="0" w:color="auto"/>
               <w:bottom w:val="nil"/>
             </w:tcBorders>
-            <w:shd w:val="clear" w:color="auto" w:fill="auto"/>
           </w:tcPr>
           <w:p>
             <w:pPr>
-              <w:pStyle w:val="NoSpacing"/>
+              <w:pStyle w:val="KeinLeerraum"/>
               <w:rPr>
                 <w:sz w:val="18"/>
                 <w:szCs w:val="18"/>
@@ -1544,11 +1539,10 @@
               <w:top w:val="single" w:sz="4" w:space="0" w:color="auto"/>
               <w:bottom w:val="nil"/>
             </w:tcBorders>
-            <w:shd w:val="clear" w:color="auto" w:fill="auto"/>
           </w:tcPr>
           <w:p>
             <w:pPr>
-              <w:pStyle w:val="NoSpacing"/>
+              <w:pStyle w:val="KeinLeerraum"/>
               <w:rPr>
                 <w:sz w:val="18"/>
                 <w:szCs w:val="18"/>
@@ -1586,11 +1580,10 @@
               <w:top w:val="nil"/>
               <w:bottom w:val="single" w:sz="4" w:space="0" w:color="auto"/>
             </w:tcBorders>
-            <w:shd w:val="clear" w:color="auto" w:fill="auto"/>
           </w:tcPr>
           <w:p>
             <w:pPr>
-              <w:pStyle w:val="NoSpacing"/>
+              <w:pStyle w:val="KeinLeerraum"/>
               <w:rPr>
                 <w:sz w:val="18"/>
                 <w:szCs w:val="18"/>
@@ -1610,7 +1603,7 @@
           </w:tcPr>
           <w:p>
             <w:pPr>
-              <w:pStyle w:val="NoSpacing"/>
+              <w:pStyle w:val="KeinLeerraum"/>
               <w:ind w:left="456" w:hanging="456"/>
               <w:rPr>
                 <w:sz w:val="18"/>
@@ -1684,7 +1677,7 @@
           </w:tcPr>
           <w:p>
             <w:pPr>
-              <w:pStyle w:val="NoSpacing"/>
+              <w:pStyle w:val="KeinLeerraum"/>
               <w:keepNext/>
               <w:spacing w:before="40" w:after="40"/>
               <w:rPr>
@@ -1715,7 +1708,7 @@
           </w:tcPr>
           <w:p>
             <w:pPr>
-              <w:pStyle w:val="NoSpacing"/>
+              <w:pStyle w:val="KeinLeerraum"/>
               <w:keepNext/>
               <w:spacing w:before="40" w:after="40"/>
               <w:ind w:left="456" w:hanging="456"/>
@@ -1829,7 +1822,7 @@
     <w:sdtContent>
       <w:p>
         <w:pPr>
-          <w:pStyle w:val="Footer"/>
+          <w:pStyle w:val="Fuzeile"/>
           <w:jc w:val="right"/>
         </w:pPr>
         <w:r>
@@ -1855,7 +1848,7 @@
   </w:sdt>
   <w:p>
     <w:pPr>
-      <w:pStyle w:val="Footer"/>
+      <w:pStyle w:val="Fuzeile"/>
     </w:pPr>
   </w:p>
 </w:ftr>
@@ -2281,18 +2274,18 @@
     <w:lsdException w:name="Unresolved Mention" w:semiHidden="1" w:unhideWhenUsed="1"/>
     <w:lsdException w:name="Smart Link" w:semiHidden="1" w:unhideWhenUsed="1"/>
   </w:latentStyles>
-  <w:style w:type="paragraph" w:default="1" w:styleId="Normal">
+  <w:style w:type="paragraph" w:default="1" w:styleId="Standard">
     <w:name w:val="Normal"/>
     <w:qFormat/>
     <w:rPr>
       <w:noProof/>
     </w:rPr>
   </w:style>
-  <w:style w:type="paragraph" w:styleId="Heading1">
+  <w:style w:type="paragraph" w:styleId="berschrift1">
     <w:name w:val="heading 1"/>
-    <w:basedOn w:val="NoSpacing"/>
-    <w:next w:val="Normal"/>
-    <w:link w:val="Heading1Char"/>
+    <w:basedOn w:val="KeinLeerraum"/>
+    <w:next w:val="Standard"/>
+    <w:link w:val="berschrift1Zchn"/>
     <w:uiPriority w:val="9"/>
     <w:qFormat/>
     <w:pPr>
@@ -2308,11 +2301,11 @@
       <w:lang w:val="de-CH"/>
     </w:rPr>
   </w:style>
-  <w:style w:type="paragraph" w:styleId="Heading2">
+  <w:style w:type="paragraph" w:styleId="berschrift2">
     <w:name w:val="heading 2"/>
-    <w:basedOn w:val="Normal"/>
-    <w:next w:val="Normal"/>
-    <w:link w:val="Heading2Char"/>
+    <w:basedOn w:val="Standard"/>
+    <w:next w:val="Standard"/>
+    <w:link w:val="berschrift2Zchn"/>
     <w:uiPriority w:val="9"/>
     <w:unhideWhenUsed/>
     <w:qFormat/>
@@ -2331,13 +2324,13 @@
       <w:lang w:val="de-CH"/>
     </w:rPr>
   </w:style>
-  <w:style w:type="character" w:default="1" w:styleId="DefaultParagraphFont">
+  <w:style w:type="character" w:default="1" w:styleId="Absatz-Standardschriftart">
     <w:name w:val="Default Paragraph Font"/>
     <w:uiPriority w:val="1"/>
     <w:semiHidden/>
     <w:unhideWhenUsed/>
   </w:style>
-  <w:style w:type="table" w:default="1" w:styleId="TableNormal">
+  <w:style w:type="table" w:default="1" w:styleId="NormaleTabelle">
     <w:name w:val="Normal Table"/>
     <w:uiPriority w:val="99"/>
     <w:semiHidden/>
@@ -2352,15 +2345,15 @@
       </w:tblCellMar>
     </w:tblPr>
   </w:style>
-  <w:style w:type="numbering" w:default="1" w:styleId="NoList">
+  <w:style w:type="numbering" w:default="1" w:styleId="KeineListe">
     <w:name w:val="No List"/>
     <w:uiPriority w:val="99"/>
     <w:semiHidden/>
     <w:unhideWhenUsed/>
   </w:style>
-  <w:style w:type="table" w:styleId="TableGrid">
+  <w:style w:type="table" w:styleId="Tabellenraster">
     <w:name w:val="Table Grid"/>
-    <w:basedOn w:val="TableNormal"/>
+    <w:basedOn w:val="NormaleTabelle"/>
     <w:uiPriority w:val="39"/>
     <w:pPr>
       <w:spacing w:after="0" w:line="240" w:lineRule="auto"/>
@@ -2376,7 +2369,7 @@
       </w:tblBorders>
     </w:tblPr>
   </w:style>
-  <w:style w:type="paragraph" w:styleId="NoSpacing">
+  <w:style w:type="paragraph" w:styleId="KeinLeerraum">
     <w:name w:val="No Spacing"/>
     <w:uiPriority w:val="1"/>
     <w:qFormat/>
@@ -2387,10 +2380,10 @@
       <w:noProof/>
     </w:rPr>
   </w:style>
-  <w:style w:type="paragraph" w:styleId="Header">
+  <w:style w:type="paragraph" w:styleId="Kopfzeile">
     <w:name w:val="header"/>
-    <w:basedOn w:val="Normal"/>
-    <w:link w:val="HeaderChar"/>
+    <w:basedOn w:val="Standard"/>
+    <w:link w:val="KopfzeileZchn"/>
     <w:uiPriority w:val="99"/>
     <w:unhideWhenUsed/>
     <w:pPr>
@@ -2401,19 +2394,19 @@
       <w:spacing w:after="0" w:line="240" w:lineRule="auto"/>
     </w:pPr>
   </w:style>
-  <w:style w:type="character" w:customStyle="1" w:styleId="HeaderChar">
-    <w:name w:val="Header Char"/>
-    <w:basedOn w:val="DefaultParagraphFont"/>
-    <w:link w:val="Header"/>
+  <w:style w:type="character" w:customStyle="1" w:styleId="KopfzeileZchn">
+    <w:name w:val="Kopfzeile Zchn"/>
+    <w:basedOn w:val="Absatz-Standardschriftart"/>
+    <w:link w:val="Kopfzeile"/>
     <w:uiPriority w:val="99"/>
     <w:rPr>
       <w:noProof/>
     </w:rPr>
   </w:style>
-  <w:style w:type="paragraph" w:styleId="Footer">
+  <w:style w:type="paragraph" w:styleId="Fuzeile">
     <w:name w:val="footer"/>
-    <w:basedOn w:val="Normal"/>
-    <w:link w:val="FooterChar"/>
+    <w:basedOn w:val="Standard"/>
+    <w:link w:val="FuzeileZchn"/>
     <w:uiPriority w:val="99"/>
     <w:unhideWhenUsed/>
     <w:pPr>
@@ -2424,19 +2417,19 @@
       <w:spacing w:after="0" w:line="240" w:lineRule="auto"/>
     </w:pPr>
   </w:style>
-  <w:style w:type="character" w:customStyle="1" w:styleId="FooterChar">
-    <w:name w:val="Footer Char"/>
-    <w:basedOn w:val="DefaultParagraphFont"/>
-    <w:link w:val="Footer"/>
+  <w:style w:type="character" w:customStyle="1" w:styleId="FuzeileZchn">
+    <w:name w:val="Fußzeile Zchn"/>
+    <w:basedOn w:val="Absatz-Standardschriftart"/>
+    <w:link w:val="Fuzeile"/>
     <w:uiPriority w:val="99"/>
     <w:rPr>
       <w:noProof/>
     </w:rPr>
   </w:style>
-  <w:style w:type="character" w:customStyle="1" w:styleId="Heading1Char">
-    <w:name w:val="Heading 1 Char"/>
-    <w:basedOn w:val="DefaultParagraphFont"/>
-    <w:link w:val="Heading1"/>
+  <w:style w:type="character" w:customStyle="1" w:styleId="berschrift1Zchn">
+    <w:name w:val="Überschrift 1 Zchn"/>
+    <w:basedOn w:val="Absatz-Standardschriftart"/>
+    <w:link w:val="berschrift1"/>
     <w:uiPriority w:val="9"/>
     <w:rPr>
       <w:b/>
@@ -2447,10 +2440,10 @@
       <w:lang w:val="de-CH"/>
     </w:rPr>
   </w:style>
-  <w:style w:type="character" w:customStyle="1" w:styleId="Heading2Char">
-    <w:name w:val="Heading 2 Char"/>
-    <w:basedOn w:val="DefaultParagraphFont"/>
-    <w:link w:val="Heading2"/>
+  <w:style w:type="character" w:customStyle="1" w:styleId="berschrift2Zchn">
+    <w:name w:val="Überschrift 2 Zchn"/>
+    <w:basedOn w:val="Absatz-Standardschriftart"/>
+    <w:link w:val="berschrift2"/>
     <w:uiPriority w:val="9"/>
     <w:rPr>
       <w:b/>
@@ -2460,10 +2453,10 @@
       <w:lang w:val="de-CH"/>
     </w:rPr>
   </w:style>
-  <w:style w:type="paragraph" w:styleId="TOC1">
+  <w:style w:type="paragraph" w:styleId="Verzeichnis1">
     <w:name w:val="toc 1"/>
-    <w:basedOn w:val="Normal"/>
-    <w:next w:val="Normal"/>
+    <w:basedOn w:val="Standard"/>
+    <w:next w:val="Standard"/>
     <w:autoRedefine/>
     <w:uiPriority w:val="39"/>
     <w:unhideWhenUsed/>
@@ -2479,10 +2472,10 @@
       <w:szCs w:val="20"/>
     </w:rPr>
   </w:style>
-  <w:style w:type="paragraph" w:styleId="TOC2">
+  <w:style w:type="paragraph" w:styleId="Verzeichnis2">
     <w:name w:val="toc 2"/>
-    <w:basedOn w:val="Normal"/>
-    <w:next w:val="Normal"/>
+    <w:basedOn w:val="Standard"/>
+    <w:next w:val="Standard"/>
     <w:autoRedefine/>
     <w:uiPriority w:val="39"/>
     <w:unhideWhenUsed/>
@@ -2501,10 +2494,10 @@
       <w:szCs w:val="18"/>
     </w:rPr>
   </w:style>
-  <w:style w:type="paragraph" w:styleId="TOC3">
+  <w:style w:type="paragraph" w:styleId="Verzeichnis3">
     <w:name w:val="toc 3"/>
-    <w:basedOn w:val="Normal"/>
-    <w:next w:val="Normal"/>
+    <w:basedOn w:val="Standard"/>
+    <w:next w:val="Standard"/>
     <w:autoRedefine/>
     <w:uiPriority w:val="39"/>
     <w:unhideWhenUsed/>
@@ -2520,10 +2513,10 @@
       <w:szCs w:val="20"/>
     </w:rPr>
   </w:style>
-  <w:style w:type="paragraph" w:styleId="TOC4">
+  <w:style w:type="paragraph" w:styleId="Verzeichnis4">
     <w:name w:val="toc 4"/>
-    <w:basedOn w:val="Normal"/>
-    <w:next w:val="Normal"/>
+    <w:basedOn w:val="Standard"/>
+    <w:next w:val="Standard"/>
     <w:autoRedefine/>
     <w:uiPriority w:val="39"/>
     <w:unhideWhenUsed/>
@@ -2537,10 +2530,10 @@
       <w:szCs w:val="18"/>
     </w:rPr>
   </w:style>
-  <w:style w:type="paragraph" w:styleId="TOC5">
+  <w:style w:type="paragraph" w:styleId="Verzeichnis5">
     <w:name w:val="toc 5"/>
-    <w:basedOn w:val="Normal"/>
-    <w:next w:val="Normal"/>
+    <w:basedOn w:val="Standard"/>
+    <w:next w:val="Standard"/>
     <w:autoRedefine/>
     <w:uiPriority w:val="39"/>
     <w:unhideWhenUsed/>
@@ -2554,10 +2547,10 @@
       <w:szCs w:val="18"/>
     </w:rPr>
   </w:style>
-  <w:style w:type="paragraph" w:styleId="TOC6">
+  <w:style w:type="paragraph" w:styleId="Verzeichnis6">
     <w:name w:val="toc 6"/>
-    <w:basedOn w:val="Normal"/>
-    <w:next w:val="Normal"/>
+    <w:basedOn w:val="Standard"/>
+    <w:next w:val="Standard"/>
     <w:autoRedefine/>
     <w:uiPriority w:val="39"/>
     <w:unhideWhenUsed/>
@@ -2571,10 +2564,10 @@
       <w:szCs w:val="18"/>
     </w:rPr>
   </w:style>
-  <w:style w:type="paragraph" w:styleId="TOC7">
+  <w:style w:type="paragraph" w:styleId="Verzeichnis7">
     <w:name w:val="toc 7"/>
-    <w:basedOn w:val="Normal"/>
-    <w:next w:val="Normal"/>
+    <w:basedOn w:val="Standard"/>
+    <w:next w:val="Standard"/>
     <w:autoRedefine/>
     <w:uiPriority w:val="39"/>
     <w:unhideWhenUsed/>
@@ -2588,10 +2581,10 @@
       <w:szCs w:val="18"/>
     </w:rPr>
   </w:style>
-  <w:style w:type="paragraph" w:styleId="TOC8">
+  <w:style w:type="paragraph" w:styleId="Verzeichnis8">
     <w:name w:val="toc 8"/>
-    <w:basedOn w:val="Normal"/>
-    <w:next w:val="Normal"/>
+    <w:basedOn w:val="Standard"/>
+    <w:next w:val="Standard"/>
     <w:autoRedefine/>
     <w:uiPriority w:val="39"/>
     <w:unhideWhenUsed/>
@@ -2605,10 +2598,10 @@
       <w:szCs w:val="18"/>
     </w:rPr>
   </w:style>
-  <w:style w:type="paragraph" w:styleId="TOC9">
+  <w:style w:type="paragraph" w:styleId="Verzeichnis9">
     <w:name w:val="toc 9"/>
-    <w:basedOn w:val="Normal"/>
-    <w:next w:val="Normal"/>
+    <w:basedOn w:val="Standard"/>
+    <w:next w:val="Standard"/>
     <w:autoRedefine/>
     <w:uiPriority w:val="39"/>
     <w:unhideWhenUsed/>
@@ -2624,7 +2617,7 @@
   </w:style>
   <w:style w:type="character" w:styleId="Hyperlink">
     <w:name w:val="Hyperlink"/>
-    <w:basedOn w:val="DefaultParagraphFont"/>
+    <w:basedOn w:val="Absatz-Standardschriftart"/>
     <w:uiPriority w:val="99"/>
     <w:unhideWhenUsed/>
     <w:rPr>
@@ -2632,10 +2625,10 @@
       <w:u w:val="single"/>
     </w:rPr>
   </w:style>
-  <w:style w:type="paragraph" w:styleId="TOCHeading">
+  <w:style w:type="paragraph" w:styleId="Inhaltsverzeichnisberschrift">
     <w:name w:val="TOC Heading"/>
-    <w:basedOn w:val="Heading1"/>
-    <w:next w:val="Normal"/>
+    <w:basedOn w:val="berschrift1"/>
+    <w:next w:val="Standard"/>
     <w:uiPriority w:val="39"/>
     <w:unhideWhenUsed/>
     <w:qFormat/>

</xml_diff>